<commit_message>
FOPA lab5: add, defence
</commit_message>
<xml_diff>
--- a/fopa/lab5/report.docx
+++ b/fopa/lab5/report.docx
@@ -134,7 +134,6 @@
         <w:rPr>
           <w:b/>
           <w:bCs/>
-          <w:lang w:val="en-US"/>
         </w:rPr>
       </w:pPr>
       <w:r>
@@ -1093,7 +1092,6 @@
         <w:rPr>
           <w:b/>
           <w:bCs/>
-          <w:lang w:val="en-US"/>
         </w:rPr>
       </w:pPr>
       <w:bookmarkStart w:id="1" w:name="_Toc227078020"/>
@@ -1134,13 +1132,21 @@
       </w:r>
     </w:p>
     <w:p>
-      <w:r>
+      <w:pPr>
         <w:rPr>
           <w:lang w:val="en-US"/>
         </w:rPr>
+      </w:pPr>
+      <w:r>
+        <w:rPr>
+          <w:lang w:val="en-US"/>
+        </w:rPr>
         <w:t>Win</w:t>
       </w:r>
       <w:r>
+        <w:rPr>
+          <w:lang w:val="en-US"/>
+        </w:rPr>
         <w:t xml:space="preserve">1251: </w:t>
       </w:r>
       <w:r>
@@ -1150,6 +1156,9 @@
         <w:t>cfced</w:t>
       </w:r>
       <w:r>
+        <w:rPr>
+          <w:lang w:val="en-US"/>
+        </w:rPr>
         <w:t>1</w:t>
       </w:r>
       <w:r>
@@ -1159,6 +1168,9 @@
         <w:t>c</w:t>
       </w:r>
       <w:r>
+        <w:rPr>
+          <w:lang w:val="en-US"/>
+        </w:rPr>
         <w:t>5</w:t>
       </w:r>
       <w:r>
@@ -1168,6 +1180,9 @@
         <w:t>d</w:t>
       </w:r>
       <w:r>
+        <w:rPr>
+          <w:lang w:val="en-US"/>
+        </w:rPr>
         <w:t>9</w:t>
       </w:r>
       <w:r>
@@ -1177,6 +1192,9 @@
         <w:t>c</w:t>
       </w:r>
       <w:r>
+        <w:rPr>
+          <w:lang w:val="en-US"/>
+        </w:rPr>
         <w:t>0</w:t>
       </w:r>
       <w:r>
@@ -1186,6 +1204,9 @@
         <w:t>c</w:t>
       </w:r>
       <w:r>
+        <w:rPr>
+          <w:lang w:val="en-US"/>
+        </w:rPr>
         <w:t>5</w:t>
       </w:r>
       <w:r>
@@ -1195,6 +1216,9 @@
         <w:t>ccced</w:t>
       </w:r>
       <w:r>
+        <w:rPr>
+          <w:lang w:val="en-US"/>
+        </w:rPr>
         <w:t>1</w:t>
       </w:r>
       <w:r>
@@ -1204,6 +1228,9 @@
         <w:t>d</w:t>
       </w:r>
       <w:r>
+        <w:rPr>
+          <w:lang w:val="en-US"/>
+        </w:rPr>
         <w:t>2</w:t>
       </w:r>
       <w:r>
@@ -1257,35 +1284,148 @@
         <w:t>fffe1f041e04210415042904100415041c041e04210422042c04</w:t>
       </w:r>
     </w:p>
-    <w:p/>
-    <w:p/>
-    <w:p/>
-    <w:p/>
-    <w:p/>
-    <w:p/>
-    <w:p/>
-    <w:p/>
-    <w:p/>
-    <w:p/>
-    <w:p/>
-    <w:p/>
-    <w:p/>
-    <w:p/>
-    <w:p/>
-    <w:p/>
+    <w:p>
+      <w:pPr>
+        <w:rPr>
+          <w:lang w:val="en-US"/>
+        </w:rPr>
+      </w:pPr>
+    </w:p>
+    <w:p>
+      <w:pPr>
+        <w:rPr>
+          <w:lang w:val="en-US"/>
+        </w:rPr>
+      </w:pPr>
+    </w:p>
+    <w:p>
+      <w:pPr>
+        <w:rPr>
+          <w:lang w:val="en-US"/>
+        </w:rPr>
+      </w:pPr>
+    </w:p>
+    <w:p>
+      <w:pPr>
+        <w:rPr>
+          <w:lang w:val="en-US"/>
+        </w:rPr>
+      </w:pPr>
+    </w:p>
+    <w:p>
+      <w:pPr>
+        <w:rPr>
+          <w:lang w:val="en-US"/>
+        </w:rPr>
+      </w:pPr>
+    </w:p>
+    <w:p>
+      <w:pPr>
+        <w:rPr>
+          <w:lang w:val="en-US"/>
+        </w:rPr>
+      </w:pPr>
+    </w:p>
+    <w:p>
+      <w:pPr>
+        <w:rPr>
+          <w:lang w:val="en-US"/>
+        </w:rPr>
+      </w:pPr>
+    </w:p>
+    <w:p>
+      <w:pPr>
+        <w:rPr>
+          <w:lang w:val="en-US"/>
+        </w:rPr>
+      </w:pPr>
+    </w:p>
+    <w:p>
+      <w:pPr>
+        <w:rPr>
+          <w:lang w:val="en-US"/>
+        </w:rPr>
+      </w:pPr>
+    </w:p>
+    <w:p>
+      <w:pPr>
+        <w:rPr>
+          <w:lang w:val="en-US"/>
+        </w:rPr>
+      </w:pPr>
+    </w:p>
+    <w:p>
+      <w:pPr>
+        <w:rPr>
+          <w:lang w:val="en-US"/>
+        </w:rPr>
+      </w:pPr>
+    </w:p>
+    <w:p>
+      <w:pPr>
+        <w:rPr>
+          <w:lang w:val="en-US"/>
+        </w:rPr>
+      </w:pPr>
+    </w:p>
+    <w:p>
+      <w:pPr>
+        <w:rPr>
+          <w:lang w:val="en-US"/>
+        </w:rPr>
+      </w:pPr>
+    </w:p>
+    <w:p>
+      <w:pPr>
+        <w:rPr>
+          <w:lang w:val="en-US"/>
+        </w:rPr>
+      </w:pPr>
+    </w:p>
+    <w:p>
+      <w:pPr>
+        <w:rPr>
+          <w:lang w:val="en-US"/>
+        </w:rPr>
+      </w:pPr>
+    </w:p>
+    <w:p>
+      <w:pPr>
+        <w:rPr>
+          <w:lang w:val="en-US"/>
+        </w:rPr>
+      </w:pPr>
+    </w:p>
     <w:p>
       <w:pPr>
         <w:pStyle w:val="Heading2"/>
         <w:jc w:val="center"/>
+        <w:rPr>
+          <w:lang w:val="en-US"/>
+        </w:rPr>
       </w:pPr>
       <w:bookmarkStart w:id="3" w:name="_Toc227078022"/>
       <w:r>
         <w:lastRenderedPageBreak/>
-        <w:t>Код программы</w:t>
+        <w:t>Код</w:t>
+      </w:r>
+      <w:r>
+        <w:rPr>
+          <w:lang w:val="en-US"/>
+        </w:rPr>
+        <w:t xml:space="preserve"> </w:t>
+      </w:r>
+      <w:r>
+        <w:t>программы</w:t>
       </w:r>
       <w:bookmarkEnd w:id="3"/>
     </w:p>
     <w:p>
+      <w:pPr>
+        <w:rPr>
+          <w:lang w:val="en-US"/>
+        </w:rPr>
+      </w:pPr>
       <w:r>
         <w:rPr>
           <w:lang w:val="en-GB"/>
@@ -1293,6 +1433,9 @@
         <w:t>ORG</w:t>
       </w:r>
       <w:r>
+        <w:rPr>
+          <w:lang w:val="en-US"/>
+        </w:rPr>
         <w:t xml:space="preserve"> 0</w:t>
       </w:r>
       <w:r>
@@ -1302,6 +1445,9 @@
         <w:t>x</w:t>
       </w:r>
       <w:r>
+        <w:rPr>
+          <w:lang w:val="en-US"/>
+        </w:rPr>
         <w:t>357</w:t>
       </w:r>
     </w:p>
@@ -1409,7 +1555,21 @@
         <w:rPr>
           <w:lang w:val="en-GB"/>
         </w:rPr>
-        <w:t xml:space="preserve">; load len     </w:t>
+        <w:t xml:space="preserve">; load </w:t>
+      </w:r>
+      <w:proofErr w:type="spellStart"/>
+      <w:r>
+        <w:rPr>
+          <w:lang w:val="en-GB"/>
+        </w:rPr>
+        <w:t>len</w:t>
+      </w:r>
+      <w:proofErr w:type="spellEnd"/>
+      <w:r>
+        <w:rPr>
+          <w:lang w:val="en-GB"/>
+        </w:rPr>
+        <w:t xml:space="preserve">     </w:t>
       </w:r>
     </w:p>
     <w:p>
@@ -1817,13 +1977,55 @@
         </w:rPr>
       </w:pPr>
     </w:p>
-    <w:p/>
-    <w:p/>
-    <w:p/>
-    <w:p/>
-    <w:p/>
-    <w:p/>
-    <w:p/>
+    <w:p>
+      <w:pPr>
+        <w:rPr>
+          <w:lang w:val="en-US"/>
+        </w:rPr>
+      </w:pPr>
+    </w:p>
+    <w:p>
+      <w:pPr>
+        <w:rPr>
+          <w:lang w:val="en-US"/>
+        </w:rPr>
+      </w:pPr>
+    </w:p>
+    <w:p>
+      <w:pPr>
+        <w:rPr>
+          <w:lang w:val="en-US"/>
+        </w:rPr>
+      </w:pPr>
+    </w:p>
+    <w:p>
+      <w:pPr>
+        <w:rPr>
+          <w:lang w:val="en-US"/>
+        </w:rPr>
+      </w:pPr>
+    </w:p>
+    <w:p>
+      <w:pPr>
+        <w:rPr>
+          <w:lang w:val="en-US"/>
+        </w:rPr>
+      </w:pPr>
+    </w:p>
+    <w:p>
+      <w:pPr>
+        <w:rPr>
+          <w:lang w:val="en-US"/>
+        </w:rPr>
+      </w:pPr>
+    </w:p>
+    <w:p>
+      <w:pPr>
+        <w:rPr>
+          <w:lang w:val="en-US"/>
+        </w:rPr>
+      </w:pPr>
+    </w:p>
     <w:p>
       <w:pPr>
         <w:pStyle w:val="Heading2"/>
@@ -1839,17 +2041,11 @@
     <w:p>
       <w:pPr>
         <w:jc w:val="center"/>
-        <w:rPr>
-          <w:lang w:val="en-US"/>
-        </w:rPr>
       </w:pPr>
       <w:r>
         <w:t>Область представления</w:t>
       </w:r>
       <w:r>
-        <w:rPr>
-          <w:lang w:val="en-US"/>
-        </w:rPr>
         <w:t>:</w:t>
       </w:r>
     </w:p>
@@ -1887,9 +2083,6 @@
         <w:t>размер массива</w:t>
       </w:r>
       <w:r>
-        <w:rPr>
-          <w:lang w:val="en-US"/>
-        </w:rPr>
         <w:t xml:space="preserve">, </w:t>
       </w:r>
       <w:r>

</xml_diff>